<commit_message>
docs(sync): record v5 production acceptance status
</commit_message>
<xml_diff>
--- a/jackyun-portal/docs/sync-v5-empty-schedule-3.47.8.docx
+++ b/jackyun-portal/docs/sync-v5-empty-schedule-3.47.8.docx
@@ -1788,6 +1788,268 @@
         <w:t>staging 数据库名称：jackyun_v5_stage_20261026。当前仍保留在 jackyunasia PostgreSQL 服务器，仅用于继续受控 HTTP/认证验收；测试期间测试事务均已回滚。结束验收后应删除该 staging 数据库及不再需要的临时副本，再复核生产库仍未开 v5 灰度。</w:t>
       </w:r>
     </w:p>
+    <w:p>
+      <w:r>
+        <w:br w:type="page"/>
+      </w:r>
+    </w:p>
+    <w:p>
+      <w:pPr>
+        <w:pStyle w:val="Heading1"/>
+        <w:keepNext/>
+      </w:pPr>
+      <w:r>
+        <w:t>9 合并与生产部署后验收记录</w:t>
+      </w:r>
+    </w:p>
+    <w:p>
+      <w:r>
+        <w:t>记录时间：2026-10-26。此补充记录更新提交合并后的状态；不改变“生产数据库迁移与 v5 灰度保持关闭”的安全边界。</w:t>
+      </w:r>
+    </w:p>
+    <w:tbl>
+      <w:tblPr>
+        <w:tblStyle w:val="TableGrid"/>
+        <w:tblW w:type="auto" w:w="0"/>
+        <w:tblLook w:firstColumn="1" w:firstRow="1" w:lastColumn="0" w:lastRow="0" w:noHBand="0" w:noVBand="1" w:val="04A0"/>
+      </w:tblPr>
+      <w:tblGrid>
+        <w:gridCol w:w="4997"/>
+        <w:gridCol w:w="4997"/>
+      </w:tblGrid>
+      <w:tr>
+        <w:tc>
+          <w:tcPr>
+            <w:tcW w:type="dxa" w:w="4997"/>
+          </w:tcPr>
+          <w:p>
+            <w:r>
+              <w:t>检查项</w:t>
+            </w:r>
+          </w:p>
+        </w:tc>
+        <w:tc>
+          <w:tcPr>
+            <w:tcW w:type="dxa" w:w="4997"/>
+          </w:tcPr>
+          <w:p>
+            <w:r>
+              <w:t>证据与结果</w:t>
+            </w:r>
+          </w:p>
+        </w:tc>
+      </w:tr>
+      <w:tr>
+        <w:tc>
+          <w:tcPr>
+            <w:tcW w:type="dxa" w:w="4997"/>
+          </w:tcPr>
+          <w:p>
+            <w:r>
+              <w:t>GitHub 合并</w:t>
+            </w:r>
+          </w:p>
+        </w:tc>
+        <w:tc>
+          <w:tcPr>
+            <w:tcW w:type="dxa" w:w="4997"/>
+          </w:tcPr>
+          <w:p>
+            <w:r>
+              <w:t>PR #164 已 squash 合并至 main；合并提交 9d0a69da5198a1695007a06f472ce7b80892d011。</w:t>
+            </w:r>
+          </w:p>
+        </w:tc>
+      </w:tr>
+      <w:tr>
+        <w:tc>
+          <w:tcPr>
+            <w:tcW w:type="dxa" w:w="4997"/>
+          </w:tcPr>
+          <w:p>
+            <w:r>
+              <w:t>Portal 生产部署</w:t>
+            </w:r>
+          </w:p>
+        </w:tc>
+        <w:tc>
+          <w:tcPr>
+            <w:tcW w:type="dxa" w:w="4997"/>
+          </w:tcPr>
+          <w:p>
+            <w:r>
+              <w:t>Vercel 部署 jackyun-portal，状态 READY；部署 commit SHA 与 main 合并提交一致，别名 jackyun.top 已关联。</w:t>
+            </w:r>
+          </w:p>
+        </w:tc>
+      </w:tr>
+      <w:tr>
+        <w:tc>
+          <w:tcPr>
+            <w:tcW w:type="dxa" w:w="4997"/>
+          </w:tcPr>
+          <w:p>
+            <w:r>
+              <w:t>Azure Functions</w:t>
+            </w:r>
+          </w:p>
+        </w:tc>
+        <w:tc>
+          <w:tcPr>
+            <w:tcW w:type="dxa" w:w="4997"/>
+          </w:tcPr>
+          <w:p>
+            <w:r>
+              <w:t>jackyun-sync-9d26b2cc 已部署 3.9.1；健康端点 HTTP 200，syncProtocol=5，transferEncoding=gzip，legacyEncoding=identity。</w:t>
+            </w:r>
+          </w:p>
+        </w:tc>
+      </w:tr>
+      <w:tr>
+        <w:tc>
+          <w:tcPr>
+            <w:tcW w:type="dxa" w:w="4997"/>
+          </w:tcPr>
+          <w:p>
+            <w:r>
+              <w:t>v5 路由与灰度</w:t>
+            </w:r>
+          </w:p>
+        </w:tc>
+        <w:tc>
+          <w:tcPr>
+            <w:tcW w:type="dxa" w:w="4997"/>
+          </w:tcPr>
+          <w:p>
+            <w:r>
+              <w:t>未认证 GET /api/sync/v5/manifest 返回 401 UNAUTHORIZED，表明请求到达认证层而非 404。Function App 未配置 SYNC_V5_USERS / SYNC_V5_SCOPES，v5 仍关闭。</w:t>
+            </w:r>
+          </w:p>
+        </w:tc>
+      </w:tr>
+      <w:tr>
+        <w:tc>
+          <w:tcPr>
+            <w:tcW w:type="dxa" w:w="4997"/>
+          </w:tcPr>
+          <w:p>
+            <w:r>
+              <w:t>数据库边界</w:t>
+            </w:r>
+          </w:p>
+        </w:tc>
+        <w:tc>
+          <w:tcPr>
+            <w:tcW w:type="dxa" w:w="4997"/>
+          </w:tcPr>
+          <w:p>
+            <w:r>
+              <w:t>没有对生产数据库执行 v5 migration 或写入；生产认证读写未验证。隔离恢复库的迁移及事务内 handler 测试通过，测试数据已回滚。</w:t>
+            </w:r>
+          </w:p>
+        </w:tc>
+      </w:tr>
+      <w:tr>
+        <w:tc>
+          <w:tcPr>
+            <w:tcW w:type="dxa" w:w="4997"/>
+          </w:tcPr>
+          <w:p>
+            <w:r>
+              <w:t>同步安全回归</w:t>
+            </w:r>
+          </w:p>
+        </w:tc>
+        <w:tc>
+          <w:tcPr>
+            <w:tcW w:type="dxa" w:w="4997"/>
+          </w:tcPr>
+          <w:p>
+            <w:r>
+              <w:t>GitHub Actions 的 Existing data safety regressions 914/914 通过；TypeScript/ESLint 与 Next 构建通过。</w:t>
+            </w:r>
+          </w:p>
+        </w:tc>
+      </w:tr>
+      <w:tr>
+        <w:tc>
+          <w:tcPr>
+            <w:tcW w:type="dxa" w:w="4997"/>
+          </w:tcPr>
+          <w:p>
+            <w:r>
+              <w:t>全站浏览器 UI 流程</w:t>
+            </w:r>
+          </w:p>
+        </w:tc>
+        <w:tc>
+          <w:tcPr>
+            <w:tcW w:type="dxa" w:w="4997"/>
+          </w:tcPr>
+          <w:p>
+            <w:r>
+              <w:t>workflow 的 Run production UI flows 失败，记录 9 个失败：quiz-ui、ielts-dashboard、active-legacy-ui、study-guide-state、music-player-state、answer-sheet-legacy、cue-route-draft、cue-search、review-queue。没有找到同一 workflow 的 main 基线运行，因此不能断言这些是基线失败或本次新增回归；它们不是本次改动的同步安全回归结果。</w:t>
+            </w:r>
+          </w:p>
+        </w:tc>
+      </w:tr>
+    </w:tbl>
+    <w:p>
+      <w:pPr>
+        <w:pStyle w:val="Heading2"/>
+      </w:pPr>
+      <w:r>
+        <w:t>9.1 距离真实 v5 端到端验收还差什么</w:t>
+      </w:r>
+    </w:p>
+    <w:p>
+      <w:pPr>
+        <w:pStyle w:val="ListBullet"/>
+      </w:pPr>
+      <w:r>
+        <w:t>需要可用的专用测试账号登录态；不要通过聊天发送密码或访问令牌。当前仅具备 Azure 订阅权限，不等于获得门户账号认证会话。</w:t>
+      </w:r>
+    </w:p>
+    <w:p>
+      <w:pPr>
+        <w:pStyle w:val="ListBullet"/>
+      </w:pPr>
+      <w:r>
+        <w:t>需要在隔离环境用认证 HTTP 请求验证 manifest、条件写入、操作回执、SHA-256 复读及重复操作幂等。当前 staging handler 测试使用真实 PostgreSQL 与真实处理器，但不是认证 HTTP 生产链路。</w:t>
+      </w:r>
+    </w:p>
+    <w:p>
+      <w:pPr>
+        <w:pStyle w:val="ListBullet"/>
+      </w:pPr>
+      <w:r>
+        <w:t>需要实际桌面与手机/PWA 双向往返，覆盖离线编辑、冲突保留、重试回执和 v4 安全回滚。</w:t>
+      </w:r>
+    </w:p>
+    <w:p>
+      <w:pPr>
+        <w:pStyle w:val="ListBullet"/>
+      </w:pPr>
+      <w:r>
+        <w:t>上述证据通过后，才可考虑给测试账号开启灰度并观察网络流量、延迟与数据库负载；当前不得对日常学习账号开启。</w:t>
+      </w:r>
+    </w:p>
+    <w:p>
+      <w:pPr>
+        <w:pStyle w:val="ListBullet"/>
+      </w:pPr>
+      <w:r>
+        <w:t>任务说明 DOCX 已提交进仓库；本机缺少 LibreOffice，Word COM 也不可用，故此 DOCX 完成了结构/内容检查，但未完成逐页视觉渲染复核。</w:t>
+      </w:r>
+    </w:p>
+    <w:p>
+      <w:pPr>
+        <w:spacing w:before="80"/>
+      </w:pPr>
+      <w:r>
+        <w:t>Portal 在线健康端点追加验证：GET https://jackyun.top/api/health 返回 HTTP 200，status=ok；该端点通过生产 Portal 对 user_settings 做只读探测。</w:t>
+      </w:r>
+    </w:p>
     <w:sectPr>
       <w:pgSz w:w="12240" w:h="15840"/>
       <w:pgMar w:top="979" w:right="1123" w:bottom="936" w:left="1123" w:header="720" w:footer="720" w:gutter="0"/>

</xml_diff>

<commit_message>
docs(sync): record v5 production acceptance status (#165)
Co-authored-by: Codex <codex@openai.com>
</commit_message>
<xml_diff>
--- a/jackyun-portal/docs/sync-v5-empty-schedule-3.47.8.docx
+++ b/jackyun-portal/docs/sync-v5-empty-schedule-3.47.8.docx
@@ -1788,6 +1788,268 @@
         <w:t>staging 数据库名称：jackyun_v5_stage_20261026。当前仍保留在 jackyunasia PostgreSQL 服务器，仅用于继续受控 HTTP/认证验收；测试期间测试事务均已回滚。结束验收后应删除该 staging 数据库及不再需要的临时副本，再复核生产库仍未开 v5 灰度。</w:t>
       </w:r>
     </w:p>
+    <w:p>
+      <w:r>
+        <w:br w:type="page"/>
+      </w:r>
+    </w:p>
+    <w:p>
+      <w:pPr>
+        <w:pStyle w:val="Heading1"/>
+        <w:keepNext/>
+      </w:pPr>
+      <w:r>
+        <w:t>9 合并与生产部署后验收记录</w:t>
+      </w:r>
+    </w:p>
+    <w:p>
+      <w:r>
+        <w:t>记录时间：2026-10-26。此补充记录更新提交合并后的状态；不改变“生产数据库迁移与 v5 灰度保持关闭”的安全边界。</w:t>
+      </w:r>
+    </w:p>
+    <w:tbl>
+      <w:tblPr>
+        <w:tblStyle w:val="TableGrid"/>
+        <w:tblW w:type="auto" w:w="0"/>
+        <w:tblLook w:firstColumn="1" w:firstRow="1" w:lastColumn="0" w:lastRow="0" w:noHBand="0" w:noVBand="1" w:val="04A0"/>
+      </w:tblPr>
+      <w:tblGrid>
+        <w:gridCol w:w="4997"/>
+        <w:gridCol w:w="4997"/>
+      </w:tblGrid>
+      <w:tr>
+        <w:tc>
+          <w:tcPr>
+            <w:tcW w:type="dxa" w:w="4997"/>
+          </w:tcPr>
+          <w:p>
+            <w:r>
+              <w:t>检查项</w:t>
+            </w:r>
+          </w:p>
+        </w:tc>
+        <w:tc>
+          <w:tcPr>
+            <w:tcW w:type="dxa" w:w="4997"/>
+          </w:tcPr>
+          <w:p>
+            <w:r>
+              <w:t>证据与结果</w:t>
+            </w:r>
+          </w:p>
+        </w:tc>
+      </w:tr>
+      <w:tr>
+        <w:tc>
+          <w:tcPr>
+            <w:tcW w:type="dxa" w:w="4997"/>
+          </w:tcPr>
+          <w:p>
+            <w:r>
+              <w:t>GitHub 合并</w:t>
+            </w:r>
+          </w:p>
+        </w:tc>
+        <w:tc>
+          <w:tcPr>
+            <w:tcW w:type="dxa" w:w="4997"/>
+          </w:tcPr>
+          <w:p>
+            <w:r>
+              <w:t>PR #164 已 squash 合并至 main；合并提交 9d0a69da5198a1695007a06f472ce7b80892d011。</w:t>
+            </w:r>
+          </w:p>
+        </w:tc>
+      </w:tr>
+      <w:tr>
+        <w:tc>
+          <w:tcPr>
+            <w:tcW w:type="dxa" w:w="4997"/>
+          </w:tcPr>
+          <w:p>
+            <w:r>
+              <w:t>Portal 生产部署</w:t>
+            </w:r>
+          </w:p>
+        </w:tc>
+        <w:tc>
+          <w:tcPr>
+            <w:tcW w:type="dxa" w:w="4997"/>
+          </w:tcPr>
+          <w:p>
+            <w:r>
+              <w:t>Vercel 部署 jackyun-portal，状态 READY；部署 commit SHA 与 main 合并提交一致，别名 jackyun.top 已关联。</w:t>
+            </w:r>
+          </w:p>
+        </w:tc>
+      </w:tr>
+      <w:tr>
+        <w:tc>
+          <w:tcPr>
+            <w:tcW w:type="dxa" w:w="4997"/>
+          </w:tcPr>
+          <w:p>
+            <w:r>
+              <w:t>Azure Functions</w:t>
+            </w:r>
+          </w:p>
+        </w:tc>
+        <w:tc>
+          <w:tcPr>
+            <w:tcW w:type="dxa" w:w="4997"/>
+          </w:tcPr>
+          <w:p>
+            <w:r>
+              <w:t>jackyun-sync-9d26b2cc 已部署 3.9.1；健康端点 HTTP 200，syncProtocol=5，transferEncoding=gzip，legacyEncoding=identity。</w:t>
+            </w:r>
+          </w:p>
+        </w:tc>
+      </w:tr>
+      <w:tr>
+        <w:tc>
+          <w:tcPr>
+            <w:tcW w:type="dxa" w:w="4997"/>
+          </w:tcPr>
+          <w:p>
+            <w:r>
+              <w:t>v5 路由与灰度</w:t>
+            </w:r>
+          </w:p>
+        </w:tc>
+        <w:tc>
+          <w:tcPr>
+            <w:tcW w:type="dxa" w:w="4997"/>
+          </w:tcPr>
+          <w:p>
+            <w:r>
+              <w:t>未认证 GET /api/sync/v5/manifest 返回 401 UNAUTHORIZED，表明请求到达认证层而非 404。Function App 未配置 SYNC_V5_USERS / SYNC_V5_SCOPES，v5 仍关闭。</w:t>
+            </w:r>
+          </w:p>
+        </w:tc>
+      </w:tr>
+      <w:tr>
+        <w:tc>
+          <w:tcPr>
+            <w:tcW w:type="dxa" w:w="4997"/>
+          </w:tcPr>
+          <w:p>
+            <w:r>
+              <w:t>数据库边界</w:t>
+            </w:r>
+          </w:p>
+        </w:tc>
+        <w:tc>
+          <w:tcPr>
+            <w:tcW w:type="dxa" w:w="4997"/>
+          </w:tcPr>
+          <w:p>
+            <w:r>
+              <w:t>没有对生产数据库执行 v5 migration 或写入；生产认证读写未验证。隔离恢复库的迁移及事务内 handler 测试通过，测试数据已回滚。</w:t>
+            </w:r>
+          </w:p>
+        </w:tc>
+      </w:tr>
+      <w:tr>
+        <w:tc>
+          <w:tcPr>
+            <w:tcW w:type="dxa" w:w="4997"/>
+          </w:tcPr>
+          <w:p>
+            <w:r>
+              <w:t>同步安全回归</w:t>
+            </w:r>
+          </w:p>
+        </w:tc>
+        <w:tc>
+          <w:tcPr>
+            <w:tcW w:type="dxa" w:w="4997"/>
+          </w:tcPr>
+          <w:p>
+            <w:r>
+              <w:t>GitHub Actions 的 Existing data safety regressions 914/914 通过；TypeScript/ESLint 与 Next 构建通过。</w:t>
+            </w:r>
+          </w:p>
+        </w:tc>
+      </w:tr>
+      <w:tr>
+        <w:tc>
+          <w:tcPr>
+            <w:tcW w:type="dxa" w:w="4997"/>
+          </w:tcPr>
+          <w:p>
+            <w:r>
+              <w:t>全站浏览器 UI 流程</w:t>
+            </w:r>
+          </w:p>
+        </w:tc>
+        <w:tc>
+          <w:tcPr>
+            <w:tcW w:type="dxa" w:w="4997"/>
+          </w:tcPr>
+          <w:p>
+            <w:r>
+              <w:t>workflow 的 Run production UI flows 失败，记录 9 个失败：quiz-ui、ielts-dashboard、active-legacy-ui、study-guide-state、music-player-state、answer-sheet-legacy、cue-route-draft、cue-search、review-queue。没有找到同一 workflow 的 main 基线运行，因此不能断言这些是基线失败或本次新增回归；它们不是本次改动的同步安全回归结果。</w:t>
+            </w:r>
+          </w:p>
+        </w:tc>
+      </w:tr>
+    </w:tbl>
+    <w:p>
+      <w:pPr>
+        <w:pStyle w:val="Heading2"/>
+      </w:pPr>
+      <w:r>
+        <w:t>9.1 距离真实 v5 端到端验收还差什么</w:t>
+      </w:r>
+    </w:p>
+    <w:p>
+      <w:pPr>
+        <w:pStyle w:val="ListBullet"/>
+      </w:pPr>
+      <w:r>
+        <w:t>需要可用的专用测试账号登录态；不要通过聊天发送密码或访问令牌。当前仅具备 Azure 订阅权限，不等于获得门户账号认证会话。</w:t>
+      </w:r>
+    </w:p>
+    <w:p>
+      <w:pPr>
+        <w:pStyle w:val="ListBullet"/>
+      </w:pPr>
+      <w:r>
+        <w:t>需要在隔离环境用认证 HTTP 请求验证 manifest、条件写入、操作回执、SHA-256 复读及重复操作幂等。当前 staging handler 测试使用真实 PostgreSQL 与真实处理器，但不是认证 HTTP 生产链路。</w:t>
+      </w:r>
+    </w:p>
+    <w:p>
+      <w:pPr>
+        <w:pStyle w:val="ListBullet"/>
+      </w:pPr>
+      <w:r>
+        <w:t>需要实际桌面与手机/PWA 双向往返，覆盖离线编辑、冲突保留、重试回执和 v4 安全回滚。</w:t>
+      </w:r>
+    </w:p>
+    <w:p>
+      <w:pPr>
+        <w:pStyle w:val="ListBullet"/>
+      </w:pPr>
+      <w:r>
+        <w:t>上述证据通过后，才可考虑给测试账号开启灰度并观察网络流量、延迟与数据库负载；当前不得对日常学习账号开启。</w:t>
+      </w:r>
+    </w:p>
+    <w:p>
+      <w:pPr>
+        <w:pStyle w:val="ListBullet"/>
+      </w:pPr>
+      <w:r>
+        <w:t>任务说明 DOCX 已提交进仓库；本机缺少 LibreOffice，Word COM 也不可用，故此 DOCX 完成了结构/内容检查，但未完成逐页视觉渲染复核。</w:t>
+      </w:r>
+    </w:p>
+    <w:p>
+      <w:pPr>
+        <w:spacing w:before="80"/>
+      </w:pPr>
+      <w:r>
+        <w:t>Portal 在线健康端点追加验证：GET https://jackyun.top/api/health 返回 HTTP 200，status=ok；该端点通过生产 Portal 对 user_settings 做只读探测。</w:t>
+      </w:r>
+    </w:p>
     <w:sectPr>
       <w:pgSz w:w="12240" w:h="15840"/>
       <w:pgMar w:top="979" w:right="1123" w:bottom="936" w:left="1123" w:header="720" w:footer="720" w:gutter="0"/>

</xml_diff>

<commit_message>
docs(sync): record production v5 schema migration
</commit_message>
<xml_diff>
--- a/jackyun-portal/docs/sync-v5-empty-schedule-3.47.8.docx
+++ b/jackyun-portal/docs/sync-v5-empty-schedule-3.47.8.docx
@@ -1944,7 +1944,7 @@
           </w:tcPr>
           <w:p>
             <w:r>
-              <w:t>没有对生产数据库执行 v5 migration 或写入；生产认证读写未验证。隔离恢复库的迁移及事务内 handler 测试通过，测试数据已回滚。</w:t>
+              <w:t>生产 v5 schema 已于 2026-10-26 按事务迁移成功应用。五张 v5 表均启用 RLS，runtime CRUD grants 正确，迁移后均为 0 行；没有用户数据写入或灰度启用。真实账号认证写入仍未验收。</w:t>
             </w:r>
           </w:p>
         </w:tc>
@@ -2048,6 +2048,39 @@
       </w:pPr>
       <w:r>
         <w:t>Portal 在线健康端点追加验证：GET https://jackyun.top/api/health 返回 HTTP 200，status=ok；该端点通过生产 Portal 对 user_settings 做只读探测。</w:t>
+      </w:r>
+    </w:p>
+    <w:p>
+      <w:pPr>
+        <w:pStyle w:val="Heading2"/>
+      </w:pPr>
+      <w:r>
+        <w:t>9.2 生产数据库 schema 迁移详情</w:t>
+      </w:r>
+    </w:p>
+    <w:p>
+      <w:r>
+        <w:t>目标：jackyun_migration_20261007，PostgreSQL 17.11；管理员：jackyun_admin。迁移前只读确认五张 v5 表均不存在。迁移 SQL 的数据库名保护条件通过，DDL 在单个事务中提交。</w:t>
+      </w:r>
+    </w:p>
+    <w:p>
+      <w:r>
+        <w:t>结果：sync_v5_records、sync_v5_heads、sync_v5_changes、sync_v5_receipts、sync_v5_projection_heads 共 5 张表全部创建；5/5 启用 RLS；5/5 runtime CRUD grants 可用；每张表记录数均为 0；5 条 owner policy 均绑定 jackyun_sync_runtime。</w:t>
+      </w:r>
+    </w:p>
+    <w:p>
+      <w:r>
+        <w:t>安全执行细节：第一次执行被服务连接默认的 default_transaction_read_only=on 拦截于首条 CREATE TABLE，并自动回滚；事后只读确认五张表仍不存在。第二次仅在该 psql 连接串覆盖本会话只读默认设置，没有修改 PostgreSQL 服务器或角色级设置，事务随后成功提交。</w:t>
+      </w:r>
+    </w:p>
+    <w:p>
+      <w:r>
+        <w:t>备份/恢复证据沿用本报告前文：生产全库 custom-format dump SHA-256 827FE92B092661B43745E0359DBFA81D641434ABB9868A7F1A5AC77F8CD396B，pg_restore 列表检查通过，恢复到隔离 staging 后原 87 张应用表结构、计数与内容指纹一致；本地磁盘 BitLocker 状态未能确认。</w:t>
+      </w:r>
+    </w:p>
+    <w:p>
+      <w:r>
+        <w:t>上线边界：生产 schema 已准备，但 SYNC_V5_USERS 与 SYNC_V5_SCOPES 仍未配置；Azure 未认证 v5 路由仍返回 401。未对任何生产用户执行 v5 资源写入。下一关仍是测试账号认证 HTTP 读写、回执与 SHA-256 复读，之后才进行专用账号的桌面/手机/PWA 离线、冲突与 v4 回滚测试。</w:t>
       </w:r>
     </w:p>
     <w:sectPr>

</xml_diff>

<commit_message>
docs(sync): record production v5 schema migration (#166)
Co-authored-by: Codex <codex@openai.com>
</commit_message>
<xml_diff>
--- a/jackyun-portal/docs/sync-v5-empty-schedule-3.47.8.docx
+++ b/jackyun-portal/docs/sync-v5-empty-schedule-3.47.8.docx
@@ -1944,7 +1944,7 @@
           </w:tcPr>
           <w:p>
             <w:r>
-              <w:t>没有对生产数据库执行 v5 migration 或写入；生产认证读写未验证。隔离恢复库的迁移及事务内 handler 测试通过，测试数据已回滚。</w:t>
+              <w:t>生产 v5 schema 已于 2026-10-26 按事务迁移成功应用。五张 v5 表均启用 RLS，runtime CRUD grants 正确，迁移后均为 0 行；没有用户数据写入或灰度启用。真实账号认证写入仍未验收。</w:t>
             </w:r>
           </w:p>
         </w:tc>
@@ -2048,6 +2048,39 @@
       </w:pPr>
       <w:r>
         <w:t>Portal 在线健康端点追加验证：GET https://jackyun.top/api/health 返回 HTTP 200，status=ok；该端点通过生产 Portal 对 user_settings 做只读探测。</w:t>
+      </w:r>
+    </w:p>
+    <w:p>
+      <w:pPr>
+        <w:pStyle w:val="Heading2"/>
+      </w:pPr>
+      <w:r>
+        <w:t>9.2 生产数据库 schema 迁移详情</w:t>
+      </w:r>
+    </w:p>
+    <w:p>
+      <w:r>
+        <w:t>目标：jackyun_migration_20261007，PostgreSQL 17.11；管理员：jackyun_admin。迁移前只读确认五张 v5 表均不存在。迁移 SQL 的数据库名保护条件通过，DDL 在单个事务中提交。</w:t>
+      </w:r>
+    </w:p>
+    <w:p>
+      <w:r>
+        <w:t>结果：sync_v5_records、sync_v5_heads、sync_v5_changes、sync_v5_receipts、sync_v5_projection_heads 共 5 张表全部创建；5/5 启用 RLS；5/5 runtime CRUD grants 可用；每张表记录数均为 0；5 条 owner policy 均绑定 jackyun_sync_runtime。</w:t>
+      </w:r>
+    </w:p>
+    <w:p>
+      <w:r>
+        <w:t>安全执行细节：第一次执行被服务连接默认的 default_transaction_read_only=on 拦截于首条 CREATE TABLE，并自动回滚；事后只读确认五张表仍不存在。第二次仅在该 psql 连接串覆盖本会话只读默认设置，没有修改 PostgreSQL 服务器或角色级设置，事务随后成功提交。</w:t>
+      </w:r>
+    </w:p>
+    <w:p>
+      <w:r>
+        <w:t>备份/恢复证据沿用本报告前文：生产全库 custom-format dump SHA-256 827FE92B092661B43745E0359DBFA81D641434ABB9868A7F1A5AC77F8CD396B，pg_restore 列表检查通过，恢复到隔离 staging 后原 87 张应用表结构、计数与内容指纹一致；本地磁盘 BitLocker 状态未能确认。</w:t>
+      </w:r>
+    </w:p>
+    <w:p>
+      <w:r>
+        <w:t>上线边界：生产 schema 已准备，但 SYNC_V5_USERS 与 SYNC_V5_SCOPES 仍未配置；Azure 未认证 v5 路由仍返回 401。未对任何生产用户执行 v5 资源写入。下一关仍是测试账号认证 HTTP 读写、回执与 SHA-256 复读，之后才进行专用账号的桌面/手机/PWA 离线、冲突与 v4 回滚测试。</w:t>
       </w:r>
     </w:p>
     <w:sectPr>

</xml_diff>